<commit_message>
Update InScale application materials: enhance changelog with CI/CD and RabbitMQ evidence; revise README and cover letter for clarity; update resume to reflect new skills and experiences.
</commit_message>
<xml_diff>
--- a/companies/applications/inscale/resume.docx
+++ b/companies/applications/inscale/resume.docx
@@ -18,16 +18,16 @@
     </w:p>
     <w:p>
       <w:pPr>
-        <w:spacing w:after="40"/>
+        <w:spacing w:after="0"/>
         <w:jc w:val="center"/>
       </w:pPr>
       <w:r>
         <w:rPr>
           <w:b/>
           <w:color w:val="1B375C"/>
-          <w:sz w:val="22"/>
+          <w:sz w:val="20"/>
         </w:rPr>
-        <w:t>Senior Java Developer  |  Java  |  Spring Boot  |  PostgreSQL  |  REST APIs  |  Microservices</w:t>
+        <w:t>Senior Java Developer | Java | Spring Boot | PostgreSQL | REST APIs | Microservices</w:t>
       </w:r>
     </w:p>
     <w:p>
@@ -41,64 +41,29 @@
           <w:color w:val="525860"/>
           <w:sz w:val="18"/>
         </w:rPr>
-        <w:t>Dhaka, Bangladesh  |  Contact via LinkedIn</w:t>
+        <w:t>Dhaka, Bangladesh | Contact via LinkedIn</w:t>
       </w:r>
     </w:p>
     <w:p>
       <w:pPr>
-        <w:spacing w:after="60"/>
+        <w:spacing w:after="20"/>
         <w:jc w:val="center"/>
         <w:pBdr>
           <w:bottom w:val="single" w:sz="8" w:space="5" w:color="1B375C"/>
         </w:pBdr>
       </w:pPr>
-      <w:hyperlink r:id="rId9">
-        <w:r>
-          <w:rPr>
-            <w:color w:val="1B375C"/>
-            <w:u w:val="single"/>
-          </w:rPr>
-          <w:t>linkedin.com/in/sadmansobhan</w:t>
-        </w:r>
-      </w:hyperlink>
       <w:r>
         <w:rPr>
           <w:b w:val="0"/>
           <w:color w:val="525860"/>
           <w:sz w:val="18"/>
         </w:rPr>
-        <w:t xml:space="preserve">  |  </w:t>
+        <w:t>LinkedIn: www.linkedin.com/in/sadmansobhan | Website: www.sadmansobhan.com | GitHub: github.com/imran110219</w:t>
       </w:r>
-      <w:hyperlink r:id="rId10">
-        <w:r>
-          <w:rPr>
-            <w:color w:val="1B375C"/>
-            <w:u w:val="single"/>
-          </w:rPr>
-          <w:t>sadmansobhan.com</w:t>
-        </w:r>
-      </w:hyperlink>
-      <w:r>
-        <w:rPr>
-          <w:b w:val="0"/>
-          <w:color w:val="525860"/>
-          <w:sz w:val="18"/>
-        </w:rPr>
-        <w:t xml:space="preserve">  |  </w:t>
-      </w:r>
-      <w:hyperlink r:id="rId11">
-        <w:r>
-          <w:rPr>
-            <w:color w:val="1B375C"/>
-            <w:u w:val="single"/>
-          </w:rPr>
-          <w:t>github.com/imran110219</w:t>
-        </w:r>
-      </w:hyperlink>
     </w:p>
     <w:p>
       <w:pPr>
-        <w:pStyle w:val="ResumeSection"/>
+        <w:pStyle w:val="DesignedSection"/>
         <w:spacing w:before="140" w:after="60"/>
         <w:pBdr>
           <w:bottom w:val="single" w:sz="8" w:space="5" w:color="1B375C"/>
@@ -111,18 +76,16 @@
     </w:p>
     <w:p>
       <w:pPr>
-        <w:spacing w:after="20" w:line="247" w:lineRule="auto"/>
+        <w:spacing w:after="40"/>
+        <w:keepLines/>
       </w:pPr>
       <w:r>
-        <w:rPr>
-          <w:b w:val="0"/>
-        </w:rPr>
         <w:t>Senior Java Developer with 9+ years of experience delivering secure, scalable backend systems across government, education, healthcare, and enterprise domains. Specializes in Java, Spring Boot, PostgreSQL, REST API design, microservices, and performance optimization, with hands-on technical leadership from planning through production delivery.</w:t>
       </w:r>
     </w:p>
     <w:p>
       <w:pPr>
-        <w:pStyle w:val="ResumeSection"/>
+        <w:pStyle w:val="DesignedSection"/>
         <w:spacing w:before="140" w:after="60"/>
         <w:pBdr>
           <w:bottom w:val="single" w:sz="8" w:space="5" w:color="1B375C"/>
@@ -141,15 +104,11 @@
       </w:pPr>
       <w:r>
         <w:rPr>
-          <w:b w:val="0"/>
           <w:color w:val="1B375C"/>
         </w:rPr>
         <w:t xml:space="preserve">•  </w:t>
       </w:r>
       <w:r>
-        <w:rPr>
-          <w:b w:val="0"/>
-        </w:rPr>
         <w:t>Backend team lead contributing to grooming, planning, implementation guidance, and code reviews within a 30-person development team.</w:t>
       </w:r>
     </w:p>
@@ -161,15 +120,11 @@
       </w:pPr>
       <w:r>
         <w:rPr>
-          <w:b w:val="0"/>
           <w:color w:val="1B375C"/>
         </w:rPr>
         <w:t xml:space="preserve">•  </w:t>
       </w:r>
       <w:r>
-        <w:rPr>
-          <w:b w:val="0"/>
-        </w:rPr>
         <w:t>Contributed to backend design and delivery across an election platform comprising nearly 25 running services.</w:t>
       </w:r>
     </w:p>
@@ -181,15 +136,11 @@
       </w:pPr>
       <w:r>
         <w:rPr>
-          <w:b w:val="0"/>
           <w:color w:val="1B375C"/>
         </w:rPr>
         <w:t xml:space="preserve">•  </w:t>
       </w:r>
       <w:r>
-        <w:rPr>
-          <w:b w:val="0"/>
-        </w:rPr>
         <w:t>Helped deliver an internal election-management platform reported to support 50,000 users and approximately 100,000 daily requests during election periods.</w:t>
       </w:r>
     </w:p>
@@ -201,15 +152,11 @@
       </w:pPr>
       <w:r>
         <w:rPr>
-          <w:b w:val="0"/>
           <w:color w:val="1B375C"/>
         </w:rPr>
         <w:t xml:space="preserve">•  </w:t>
       </w:r>
       <w:r>
-        <w:rPr>
-          <w:b w:val="0"/>
-        </w:rPr>
         <w:t>Reduced exam-management system response time by 30% through Redis caching and backend performance improvements.</w:t>
       </w:r>
     </w:p>
@@ -221,15 +168,11 @@
       </w:pPr>
       <w:r>
         <w:rPr>
-          <w:b w:val="0"/>
           <w:color w:val="1B375C"/>
         </w:rPr>
         <w:t xml:space="preserve">•  </w:t>
       </w:r>
       <w:r>
-        <w:rPr>
-          <w:b w:val="0"/>
-        </w:rPr>
         <w:t>Supported production workflows used by 2,500+ administrators, 1,000 invigilators, and 1,000 examinees, including payments for nearly 30,000 students.</w:t>
       </w:r>
     </w:p>
@@ -241,21 +184,17 @@
       </w:pPr>
       <w:r>
         <w:rPr>
-          <w:b w:val="0"/>
           <w:color w:val="1B375C"/>
         </w:rPr>
         <w:t xml:space="preserve">•  </w:t>
       </w:r>
       <w:r>
-        <w:rPr>
-          <w:b w:val="0"/>
-        </w:rPr>
         <w:t>Contributed to the National Electronic Government Procurement System, supporting enterprise workflows, data integrity, and privacy.</w:t>
       </w:r>
     </w:p>
     <w:p>
       <w:pPr>
-        <w:pStyle w:val="ResumeSection"/>
+        <w:pStyle w:val="DesignedSection"/>
         <w:spacing w:before="140" w:after="60"/>
         <w:pBdr>
           <w:bottom w:val="single" w:sz="8" w:space="5" w:color="1B375C"/>
@@ -268,112 +207,87 @@
     </w:p>
     <w:p>
       <w:pPr>
-        <w:spacing w:after="20" w:line="240" w:lineRule="auto"/>
+        <w:spacing w:after="36" w:line="245" w:lineRule="auto"/>
+        <w:ind w:left="245" w:hanging="187"/>
         <w:keepLines/>
       </w:pPr>
       <w:r>
         <w:rPr>
-          <w:b/>
           <w:color w:val="1B375C"/>
-          <w:sz w:val="19"/>
         </w:rPr>
-        <w:t xml:space="preserve">Languages: </w:t>
+        <w:t xml:space="preserve">•  </w:t>
       </w:r>
       <w:r>
-        <w:rPr>
-          <w:b w:val="0"/>
-          <w:sz w:val="19"/>
-        </w:rPr>
-        <w:t>Java, SQL, C#</w:t>
+        <w:t>Languages: Java, SQL, C#</w:t>
       </w:r>
     </w:p>
     <w:p>
       <w:pPr>
-        <w:spacing w:after="20" w:line="240" w:lineRule="auto"/>
+        <w:spacing w:after="36" w:line="245" w:lineRule="auto"/>
+        <w:ind w:left="245" w:hanging="187"/>
         <w:keepLines/>
       </w:pPr>
       <w:r>
         <w:rPr>
-          <w:b/>
           <w:color w:val="1B375C"/>
-          <w:sz w:val="19"/>
         </w:rPr>
-        <w:t xml:space="preserve">Backend: </w:t>
+        <w:t xml:space="preserve">•  </w:t>
       </w:r>
       <w:r>
-        <w:rPr>
-          <w:b w:val="0"/>
-          <w:sz w:val="19"/>
-        </w:rPr>
-        <w:t>Spring Boot, Hibernate, REST APIs, Microservices, Backend Architecture</w:t>
+        <w:t>Backend: Spring Boot, Hibernate, REST APIs, RabbitMQ, Microservices, Backend Architecture</w:t>
       </w:r>
     </w:p>
     <w:p>
       <w:pPr>
-        <w:spacing w:after="20" w:line="240" w:lineRule="auto"/>
+        <w:spacing w:after="36" w:line="245" w:lineRule="auto"/>
+        <w:ind w:left="245" w:hanging="187"/>
         <w:keepLines/>
       </w:pPr>
       <w:r>
         <w:rPr>
-          <w:b/>
           <w:color w:val="1B375C"/>
-          <w:sz w:val="19"/>
         </w:rPr>
-        <w:t xml:space="preserve">Data &amp; Performance: </w:t>
+        <w:t xml:space="preserve">•  </w:t>
       </w:r>
       <w:r>
-        <w:rPr>
-          <w:b w:val="0"/>
-          <w:sz w:val="19"/>
-        </w:rPr>
-        <w:t>PostgreSQL, SQL Server, Redis, Database Modeling, Query Optimization</w:t>
+        <w:t>Data &amp; Performance: PostgreSQL, SQL Server, Redis, Database Modeling, Query Optimization</w:t>
       </w:r>
     </w:p>
     <w:p>
       <w:pPr>
-        <w:spacing w:after="20" w:line="240" w:lineRule="auto"/>
+        <w:spacing w:after="36" w:line="245" w:lineRule="auto"/>
+        <w:ind w:left="245" w:hanging="187"/>
         <w:keepLines/>
       </w:pPr>
       <w:r>
         <w:rPr>
-          <w:b/>
           <w:color w:val="1B375C"/>
-          <w:sz w:val="19"/>
         </w:rPr>
-        <w:t xml:space="preserve">Security &amp; Platform: </w:t>
+        <w:t xml:space="preserve">•  </w:t>
       </w:r>
       <w:r>
-        <w:rPr>
-          <w:b w:val="0"/>
-          <w:sz w:val="19"/>
-        </w:rPr>
-        <w:t>Keycloak, Authentication, Authorization, Kubernetes, Data Integrity</w:t>
+        <w:t>Security &amp; Platform: Keycloak, Authentication, Authorization, Kubernetes, Nginx, Data Integrity</w:t>
       </w:r>
     </w:p>
     <w:p>
       <w:pPr>
-        <w:spacing w:after="20" w:line="240" w:lineRule="auto"/>
+        <w:spacing w:after="36" w:line="245" w:lineRule="auto"/>
+        <w:ind w:left="245" w:hanging="187"/>
         <w:keepLines/>
       </w:pPr>
       <w:r>
         <w:rPr>
-          <w:b/>
           <w:color w:val="1B375C"/>
-          <w:sz w:val="19"/>
         </w:rPr>
-        <w:t xml:space="preserve">Delivery: </w:t>
+        <w:t xml:space="preserve">•  </w:t>
       </w:r>
       <w:r>
-        <w:rPr>
-          <w:b w:val="0"/>
-          <w:sz w:val="19"/>
-        </w:rPr>
-        <w:t>Agile Development, Requirements Analysis, Deployment, Code Review, Mentoring</w:t>
+        <w:t>Delivery: CI/CD, GitHub Actions, Jenkins, Locust, Agile Development, Requirements Analysis, Deployment, Code Review, Mentoring</w:t>
       </w:r>
     </w:p>
     <w:p>
       <w:pPr>
-        <w:pStyle w:val="ResumeSection"/>
+        <w:pStyle w:val="DesignedSection"/>
         <w:spacing w:before="140" w:after="60"/>
         <w:pBdr>
           <w:bottom w:val="single" w:sz="8" w:space="5" w:color="1B375C"/>
@@ -386,43 +300,22 @@
     </w:p>
     <w:p>
       <w:pPr>
-        <w:pStyle w:val="ResumeRole"/>
-        <w:spacing w:before="90" w:after="8"/>
+        <w:pStyle w:val="DesignedSubsection"/>
+        <w:spacing w:before="90" w:after="10"/>
         <w:keepNext/>
       </w:pPr>
       <w:r>
-        <w:rPr>
-          <w:b/>
-        </w:rPr>
-        <w:t>Penta Global Ltd.</w:t>
-      </w:r>
-      <w:r>
-        <w:rPr>
-          <w:b w:val="0"/>
-          <w:color w:val="525860"/>
-        </w:rPr>
-        <w:t xml:space="preserve">  |  Dhaka, Bangladesh</w:t>
+        <w:t>Penta Global Ltd. - Senior Software Engineer</w:t>
       </w:r>
     </w:p>
     <w:p>
       <w:pPr>
-        <w:spacing w:after="30"/>
+        <w:spacing w:after="40"/>
         <w:keepNext/>
+        <w:keepLines/>
       </w:pPr>
       <w:r>
-        <w:rPr>
-          <w:b/>
-          <w:sz w:val="19"/>
-        </w:rPr>
-        <w:t>Senior Software Engineer</w:t>
-      </w:r>
-      <w:r>
-        <w:rPr>
-          <w:b w:val="0"/>
-          <w:color w:val="525860"/>
-          <w:sz w:val="19"/>
-        </w:rPr>
-        <w:t xml:space="preserve">  |  August 2023 – Present</w:t>
+        <w:t>Dhaka, Bangladesh | August 2023 - Present</w:t>
       </w:r>
     </w:p>
     <w:p>
@@ -433,15 +326,11 @@
       </w:pPr>
       <w:r>
         <w:rPr>
-          <w:b w:val="0"/>
           <w:color w:val="1B375C"/>
         </w:rPr>
         <w:t xml:space="preserve">•  </w:t>
       </w:r>
       <w:r>
-        <w:rPr>
-          <w:b w:val="0"/>
-        </w:rPr>
         <w:t>Lead backend engineering activities for an Election Management System, including task allocation, grooming, planning, implementation guidance, and code reviews within a 30-person development team.</w:t>
       </w:r>
     </w:p>
@@ -453,16 +342,12 @@
       </w:pPr>
       <w:r>
         <w:rPr>
-          <w:b w:val="0"/>
           <w:color w:val="1B375C"/>
         </w:rPr>
         <w:t xml:space="preserve">•  </w:t>
       </w:r>
       <w:r>
-        <w:rPr>
-          <w:b w:val="0"/>
-        </w:rPr>
-        <w:t>Key technologies: Java, Spring Boot, Hibernate, REST APIs, Docker, Kubernetes, Keycloak.</w:t>
+        <w:t>Key technologies: Java, Spring Boot, Hibernate, REST APIs, RabbitMQ, Docker, Kubernetes, Keycloak, CI/CD, GitHub Actions.</w:t>
       </w:r>
     </w:p>
     <w:p>
@@ -473,15 +358,11 @@
       </w:pPr>
       <w:r>
         <w:rPr>
-          <w:b w:val="0"/>
           <w:color w:val="1B375C"/>
         </w:rPr>
         <w:t xml:space="preserve">•  </w:t>
       </w:r>
       <w:r>
-        <w:rPr>
-          <w:b w:val="0"/>
-        </w:rPr>
         <w:t>Design service interactions and REST API contracts across a microservices architecture of nearly 25 services, delivering secure, scalable Java and Spring Boot services.</w:t>
       </w:r>
     </w:p>
@@ -493,15 +374,11 @@
       </w:pPr>
       <w:r>
         <w:rPr>
-          <w:b w:val="0"/>
           <w:color w:val="1B375C"/>
         </w:rPr>
         <w:t xml:space="preserve">•  </w:t>
       </w:r>
       <w:r>
-        <w:rPr>
-          <w:b w:val="0"/>
-        </w:rPr>
         <w:t>Contribute to delivery of an internal system reported to support 50,000 users, alongside a public-facing application that does not require authentication.</w:t>
       </w:r>
     </w:p>
@@ -513,57 +390,12 @@
       </w:pPr>
       <w:r>
         <w:rPr>
-          <w:b w:val="0"/>
           <w:color w:val="1B375C"/>
         </w:rPr>
         <w:t xml:space="preserve">•  </w:t>
       </w:r>
       <w:r>
-        <w:rPr>
-          <w:b w:val="0"/>
-        </w:rPr>
         <w:t>Support deployments to the organization's self-managed data center using Kubernetes and digitize election-result workflows previously dependent on paperwork and physical result delivery.</w:t>
-      </w:r>
-    </w:p>
-    <w:p>
-      <w:pPr>
-        <w:pStyle w:val="ResumeRole"/>
-        <w:spacing w:before="90" w:after="8"/>
-        <w:keepNext/>
-      </w:pPr>
-      <w:r>
-        <w:rPr>
-          <w:b/>
-        </w:rPr>
-        <w:t>Dynamic Solution Innovators Ltd.</w:t>
-      </w:r>
-      <w:r>
-        <w:rPr>
-          <w:b w:val="0"/>
-          <w:color w:val="525860"/>
-        </w:rPr>
-        <w:t xml:space="preserve">  |  Dhaka, Bangladesh</w:t>
-      </w:r>
-    </w:p>
-    <w:p>
-      <w:pPr>
-        <w:spacing w:after="30"/>
-        <w:keepNext/>
-      </w:pPr>
-      <w:r>
-        <w:rPr>
-          <w:b/>
-          <w:sz w:val="19"/>
-        </w:rPr>
-        <w:t>Software Engineer</w:t>
-      </w:r>
-      <w:r>
-        <w:rPr>
-          <w:b w:val="0"/>
-          <w:color w:val="525860"/>
-          <w:sz w:val="19"/>
-        </w:rPr>
-        <w:t xml:space="preserve">  |  January 2022 – July 2023</w:t>
       </w:r>
     </w:p>
     <w:p>
@@ -574,15 +406,47 @@
       </w:pPr>
       <w:r>
         <w:rPr>
-          <w:b w:val="0"/>
           <w:color w:val="1B375C"/>
         </w:rPr>
         <w:t xml:space="preserve">•  </w:t>
       </w:r>
       <w:r>
+        <w:t>Used RabbitMQ for election-management workflows and CI/CD pipelines, including GitHub Actions, across projects.</w:t>
+      </w:r>
+    </w:p>
+    <w:p>
+      <w:pPr>
+        <w:pStyle w:val="DesignedSubsection"/>
+        <w:spacing w:before="90" w:after="10"/>
+        <w:keepNext/>
+      </w:pPr>
+      <w:r>
+        <w:t>Dynamic Solution Innovators Ltd. - Software Engineer</w:t>
+      </w:r>
+    </w:p>
+    <w:p>
+      <w:pPr>
+        <w:spacing w:after="40"/>
+        <w:keepNext/>
+        <w:keepLines/>
+      </w:pPr>
+      <w:r>
+        <w:t>Dhaka, Bangladesh | January 2022 - July 2023</w:t>
+      </w:r>
+    </w:p>
+    <w:p>
+      <w:pPr>
+        <w:spacing w:after="36" w:line="245" w:lineRule="auto"/>
+        <w:ind w:left="245" w:hanging="187"/>
+        <w:keepLines/>
+      </w:pPr>
+      <w:r>
         <w:rPr>
-          <w:b w:val="0"/>
+          <w:color w:val="1B375C"/>
         </w:rPr>
+        <w:t xml:space="preserve">•  </w:t>
+      </w:r>
+      <w:r>
         <w:t>Led development of an exam management system using Java, Spring Boot, PostgreSQL, Flutter, and Crystal Reports; analyzed requirements and designed its database schema.</w:t>
       </w:r>
     </w:p>
@@ -594,15 +458,11 @@
       </w:pPr>
       <w:r>
         <w:rPr>
-          <w:b w:val="0"/>
           <w:color w:val="1B375C"/>
         </w:rPr>
         <w:t xml:space="preserve">•  </w:t>
       </w:r>
       <w:r>
-        <w:rPr>
-          <w:b w:val="0"/>
-        </w:rPr>
         <w:t>Reduced system response time by 30% through Redis caching and backend performance improvements.</w:t>
       </w:r>
     </w:p>
@@ -614,15 +474,27 @@
       </w:pPr>
       <w:r>
         <w:rPr>
-          <w:b w:val="0"/>
           <w:color w:val="1B375C"/>
         </w:rPr>
         <w:t xml:space="preserve">•  </w:t>
       </w:r>
       <w:r>
+        <w:t>Used Jenkins for CI/CD and Locust for load testing.</w:t>
+      </w:r>
+    </w:p>
+    <w:p>
+      <w:pPr>
+        <w:spacing w:after="36" w:line="245" w:lineRule="auto"/>
+        <w:ind w:left="245" w:hanging="187"/>
+        <w:keepLines/>
+      </w:pPr>
+      <w:r>
         <w:rPr>
-          <w:b w:val="0"/>
+          <w:color w:val="1B375C"/>
         </w:rPr>
+        <w:t xml:space="preserve">•  </w:t>
+      </w:r>
+      <w:r>
         <w:t>Built a real-time administrator dashboard associated with a reported 40% increase in system usage.</w:t>
       </w:r>
     </w:p>
@@ -634,62 +506,32 @@
       </w:pPr>
       <w:r>
         <w:rPr>
-          <w:b w:val="0"/>
           <w:color w:val="1B375C"/>
         </w:rPr>
         <w:t xml:space="preserve">•  </w:t>
       </w:r>
       <w:r>
-        <w:rPr>
-          <w:b w:val="0"/>
-        </w:rPr>
         <w:t>Deployed a production system used by 2,500+ administrators, 1,000 exam invigilators, and 1,000 examinees; supported registration and payment management for nearly 30,000 students.</w:t>
       </w:r>
     </w:p>
     <w:p>
+      <w:pPr>
+        <w:pStyle w:val="DesignedSubsection"/>
+        <w:spacing w:before="90" w:after="10"/>
+        <w:keepNext/>
+      </w:pPr>
       <w:r>
-        <w:br w:type="page"/>
+        <w:t>Dohatec New Media - Java Software Engineer</w:t>
       </w:r>
     </w:p>
     <w:p>
       <w:pPr>
-        <w:pStyle w:val="ResumeRole"/>
-        <w:spacing w:before="90" w:after="8"/>
+        <w:spacing w:after="40"/>
         <w:keepNext/>
+        <w:keepLines/>
       </w:pPr>
       <w:r>
-        <w:rPr>
-          <w:b/>
-        </w:rPr>
-        <w:t>Dohatec New Media</w:t>
-      </w:r>
-      <w:r>
-        <w:rPr>
-          <w:b w:val="0"/>
-          <w:color w:val="525860"/>
-        </w:rPr>
-        <w:t xml:space="preserve">  |  Dhaka, Bangladesh</w:t>
-      </w:r>
-    </w:p>
-    <w:p>
-      <w:pPr>
-        <w:spacing w:after="30"/>
-        <w:keepNext/>
-      </w:pPr>
-      <w:r>
-        <w:rPr>
-          <w:b/>
-          <w:sz w:val="19"/>
-        </w:rPr>
-        <w:t>Java Software Engineer</w:t>
-      </w:r>
-      <w:r>
-        <w:rPr>
-          <w:b w:val="0"/>
-          <w:color w:val="525860"/>
-          <w:sz w:val="19"/>
-        </w:rPr>
-        <w:t xml:space="preserve">  |  October 2016 – December 2021</w:t>
+        <w:t>Dhaka, Bangladesh | October 2016 - December 2021</w:t>
       </w:r>
     </w:p>
     <w:p>
@@ -700,15 +542,11 @@
       </w:pPr>
       <w:r>
         <w:rPr>
-          <w:b w:val="0"/>
           <w:color w:val="1B375C"/>
         </w:rPr>
         <w:t xml:space="preserve">•  </w:t>
       </w:r>
       <w:r>
-        <w:rPr>
-          <w:b w:val="0"/>
-        </w:rPr>
         <w:t>Implemented features and resolved defects for the National Electronic Government Procurement System while preserving data privacy and integrity.</w:t>
       </w:r>
     </w:p>
@@ -720,57 +558,32 @@
       </w:pPr>
       <w:r>
         <w:rPr>
-          <w:b w:val="0"/>
           <w:color w:val="1B375C"/>
         </w:rPr>
         <w:t xml:space="preserve">•  </w:t>
       </w:r>
       <w:r>
-        <w:rPr>
-          <w:b w:val="0"/>
-        </w:rPr>
         <w:t>Contributed to large-file upload capabilities, relational data modeling, and enterprise workflow features.</w:t>
       </w:r>
     </w:p>
     <w:p>
       <w:pPr>
-        <w:pStyle w:val="ResumeRole"/>
-        <w:spacing w:before="90" w:after="8"/>
+        <w:pStyle w:val="DesignedSubsection"/>
+        <w:spacing w:before="90" w:after="10"/>
         <w:keepNext/>
       </w:pPr>
       <w:r>
-        <w:rPr>
-          <w:b/>
-        </w:rPr>
-        <w:t>Jaliks Soft IT Limited</w:t>
-      </w:r>
-      <w:r>
-        <w:rPr>
-          <w:b w:val="0"/>
-          <w:color w:val="525860"/>
-        </w:rPr>
-        <w:t xml:space="preserve">  |  Khulna, Bangladesh</w:t>
+        <w:t>Jaliks Soft IT Limited - .NET Developer</w:t>
       </w:r>
     </w:p>
     <w:p>
       <w:pPr>
-        <w:spacing w:after="30"/>
+        <w:spacing w:after="40"/>
         <w:keepNext/>
+        <w:keepLines/>
       </w:pPr>
       <w:r>
-        <w:rPr>
-          <w:b/>
-          <w:sz w:val="19"/>
-        </w:rPr>
-        <w:t>.NET Developer</w:t>
-      </w:r>
-      <w:r>
-        <w:rPr>
-          <w:b w:val="0"/>
-          <w:color w:val="525860"/>
-          <w:sz w:val="19"/>
-        </w:rPr>
-        <w:t xml:space="preserve">  |  February 2016 – June 2016</w:t>
+        <w:t>Khulna, Bangladesh | February 2016 - June 2016</w:t>
       </w:r>
     </w:p>
     <w:p>
@@ -781,21 +594,17 @@
       </w:pPr>
       <w:r>
         <w:rPr>
-          <w:b w:val="0"/>
           <w:color w:val="1B375C"/>
         </w:rPr>
         <w:t xml:space="preserve">•  </w:t>
       </w:r>
       <w:r>
-        <w:rPr>
-          <w:b w:val="0"/>
-        </w:rPr>
         <w:t>Implemented features and resolved defects for a large-scale education application using ASP.NET, C#, and SQL Server.</w:t>
       </w:r>
     </w:p>
     <w:p>
       <w:pPr>
-        <w:pStyle w:val="ResumeSection"/>
+        <w:pStyle w:val="DesignedSection"/>
         <w:spacing w:before="140" w:after="60"/>
         <w:pBdr>
           <w:bottom w:val="single" w:sz="8" w:space="5" w:color="1B375C"/>
@@ -808,14 +617,11 @@
     </w:p>
     <w:p>
       <w:pPr>
-        <w:pStyle w:val="ResumeRole"/>
-        <w:spacing w:before="90" w:after="8"/>
+        <w:pStyle w:val="DesignedSubsection"/>
+        <w:spacing w:before="90" w:after="10"/>
         <w:keepNext/>
       </w:pPr>
       <w:r>
-        <w:rPr>
-          <w:b/>
-        </w:rPr>
         <w:t>Open-Care | Java, Spring Boot, PostgreSQL, Next.js</w:t>
       </w:r>
     </w:p>
@@ -827,28 +633,21 @@
       </w:pPr>
       <w:r>
         <w:rPr>
-          <w:b w:val="0"/>
           <w:color w:val="1B375C"/>
         </w:rPr>
         <w:t xml:space="preserve">•  </w:t>
       </w:r>
       <w:r>
-        <w:rPr>
-          <w:b w:val="0"/>
-        </w:rPr>
         <w:t>Lead contributor to an open-source healthcare-information platform; built a documented Spring Boot REST API with Redis, Keycloak authorization, MinIO, Liquibase, and Docker.</w:t>
       </w:r>
     </w:p>
     <w:p>
       <w:pPr>
-        <w:pStyle w:val="ResumeRole"/>
-        <w:spacing w:before="90" w:after="8"/>
+        <w:pStyle w:val="DesignedSubsection"/>
+        <w:spacing w:before="90" w:after="10"/>
         <w:keepNext/>
       </w:pPr>
       <w:r>
-        <w:rPr>
-          <w:b/>
-        </w:rPr>
         <w:t>FactLens | Next.js, Strapi, PostgreSQL, Cloudflare</w:t>
       </w:r>
     </w:p>
@@ -860,21 +659,17 @@
       </w:pPr>
       <w:r>
         <w:rPr>
-          <w:b w:val="0"/>
           <w:color w:val="1B375C"/>
         </w:rPr>
         <w:t xml:space="preserve">•  </w:t>
       </w:r>
       <w:r>
-        <w:rPr>
-          <w:b w:val="0"/>
-        </w:rPr>
         <w:t>Built and deployed the full-stack editorial platform, including the frontend, Strapi backend and content APIs, PostgreSQL database, and Cloudflare file storage.</w:t>
       </w:r>
     </w:p>
     <w:p>
       <w:pPr>
-        <w:pStyle w:val="ResumeSection"/>
+        <w:pStyle w:val="DesignedSection"/>
         <w:spacing w:before="140" w:after="60"/>
         <w:pBdr>
           <w:bottom w:val="single" w:sz="8" w:space="5" w:color="1B375C"/>
@@ -887,28 +682,16 @@
     </w:p>
     <w:p>
       <w:pPr>
-        <w:spacing w:after="0"/>
+        <w:spacing w:after="40"/>
         <w:keepLines/>
       </w:pPr>
       <w:r>
-        <w:rPr>
-          <w:b/>
-          <w:sz w:val="19"/>
-        </w:rPr>
-        <w:t>Bachelor of Science (B.Sc.) in Computer Science and Engineering</w:t>
-      </w:r>
-      <w:r>
-        <w:rPr>
-          <w:b w:val="0"/>
-          <w:color w:val="525860"/>
-          <w:sz w:val="19"/>
-        </w:rPr>
-        <w:t xml:space="preserve">  |  Khulna University  |  2011–2016</w:t>
+        <w:t>Khulna University | Bachelor of Science (B.Sc.) in Computer Science and Engineering | 2011–2016</w:t>
       </w:r>
     </w:p>
     <w:sectPr>
       <w:pgSz w:w="11905" w:h="16838"/>
-      <w:pgMar w:top="792" w:right="893" w:bottom="792" w:left="893" w:header="360" w:footer="360" w:gutter="0"/>
+      <w:pgMar w:top="835" w:right="922" w:bottom="835" w:left="922" w:header="720" w:footer="720" w:gutter="0"/>
       <w:cols w:space="720"/>
       <w:docGrid w:linePitch="360"/>
     </w:sectPr>
@@ -12970,8 +12753,8 @@
       </w:tcPr>
     </w:tblStylePr>
   </w:style>
-  <w:style w:type="paragraph" w:customStyle="1" w:styleId="ResumeSection">
-    <w:name w:val="Resume Section"/>
+  <w:style w:type="paragraph" w:customStyle="1" w:styleId="DesignedSection">
+    <w:name w:val="Designed Section"/>
     <w:rPr>
       <w:rFonts w:ascii="Arial" w:hAnsi="Arial" w:eastAsia="Arial"/>
       <w:b/>
@@ -12979,8 +12762,8 @@
       <w:sz w:val="22"/>
     </w:rPr>
   </w:style>
-  <w:style w:type="paragraph" w:customStyle="1" w:styleId="ResumeRole">
-    <w:name w:val="Resume Role"/>
+  <w:style w:type="paragraph" w:customStyle="1" w:styleId="DesignedSubsection">
+    <w:name w:val="Designed Subsection"/>
     <w:rPr>
       <w:rFonts w:ascii="Arial" w:hAnsi="Arial" w:eastAsia="Arial"/>
       <w:b/>

</xml_diff>